<commit_message>
Simplify car valuation page copy and styles
</commit_message>
<xml_diff>
--- a/Отчет_по_лабораторной_работе_Docker_Compose.docx
+++ b/Отчет_по_лабораторной_работе_Docker_Compose.docx
@@ -40,7 +40,7 @@
     </w:p>
     <w:p>
       <w:r>
-        <w:t>Развернуть многокомпонентное приложение для расчёта ориентировочной стоимости автомобиля по году выпуска и пробегу. Сохранить историю оценок в базе данных и проверить взаимодействие четырёх контейнеров.</w:t>
+        <w:t>Развернуть многокомпонентное приложение для расчёта стоимости автомобиля по году выпуска и пробегу. Сохранить историю оценок в базе данных и проверить взаимодействие четырёх контейнеров.</w:t>
       </w:r>
     </w:p>
     <w:p>
@@ -248,7 +248,7 @@
     </w:p>
     <w:p>
       <w:r>
-        <w:t>Скрипт db/init.sql создаёт таблицы car_models и valuation_history и добавляет пять моделей. История сначала пуста. Стоимость рассчитывается по учебной формуле: базовая цена × max(0,25; 0,90 ^ возраст) × max(0,50; 1 − пробег / 500 000). Результат округляется до 1 000 ₽. Базовые цены условные, поэтому оценка не является котировкой рынка.</w:t>
+        <w:t>Скрипт db/init.sql создаёт таблицы car_models и valuation_history и добавляет пять моделей. История сначала пуста. Стоимость рассчитывается по формуле: базовая цена × max(0,25; 0,90 ^ возраст) × max(0,50; 1 − пробег / 500 000). Результат округляется до 1 000 ₽. Базовые цены моделей заданы в db/init.sql.</w:t>
       </w:r>
     </w:p>
     <w:p>
@@ -266,7 +266,7 @@
     </w:p>
     <w:p>
       <w:r>
-        <w:t>Кнопка «Оценить авто» отправляет POST /api/valuations, кнопка «Показать историю» получает GET /api/valuations. Для Lada Vesta 2021 года с пробегом 60 000 км получена оценка 935 000 ₽. После обновления страницы запись осталась в истории. Некорректный будущий год API отклоняет с кодом 400.</w:t>
+        <w:t>Кнопка «Оценить авто» отправляет POST /api/valuations, кнопка «Показать историю» получает GET /api/valuations. Для Kia Rio 2022 года с пробегом 50 000 км получена оценка 1 299 000 ₽. После обновления страницы запись осталась в истории. Некорректный будущий год API отклоняет с кодом 400.</w:t>
       </w:r>
     </w:p>
     <w:p>
@@ -294,7 +294,7 @@
       <w:r>
         <w:drawing>
           <wp:inline xmlns:a="http://schemas.openxmlformats.org/drawingml/2006/main" xmlns:pic="http://schemas.openxmlformats.org/drawingml/2006/picture">
-            <wp:extent cx="5400000" cy="4533333"/>
+            <wp:extent cx="5400000" cy="4920000"/>
             <wp:docPr id="1" name="Picture 1"/>
             <wp:cNvGraphicFramePr>
               <a:graphicFrameLocks noChangeAspect="1"/>
@@ -315,7 +315,7 @@
                   <pic:spPr>
                     <a:xfrm>
                       <a:off x="0" y="0"/>
-                      <a:ext cx="5400000" cy="4533333"/>
+                      <a:ext cx="5400000" cy="4920000"/>
                     </a:xfrm>
                     <a:prstGeom prst="rect"/>
                   </pic:spPr>
@@ -331,7 +331,7 @@
         <w:jc w:val="center"/>
       </w:pPr>
       <w:r>
-        <w:t>Рисунок 1 — Расчёт ориентировочной стоимости</w:t>
+        <w:t>Рисунок 1 — Расчёт стоимости</w:t>
       </w:r>
     </w:p>
     <w:p>
@@ -351,7 +351,7 @@
       <w:r>
         <w:drawing>
           <wp:inline xmlns:a="http://schemas.openxmlformats.org/drawingml/2006/main" xmlns:pic="http://schemas.openxmlformats.org/drawingml/2006/picture">
-            <wp:extent cx="5400000" cy="4533333"/>
+            <wp:extent cx="5400000" cy="4680000"/>
             <wp:docPr id="2" name="Picture 2"/>
             <wp:cNvGraphicFramePr>
               <a:graphicFrameLocks noChangeAspect="1"/>
@@ -372,7 +372,7 @@
                   <pic:spPr>
                     <a:xfrm>
                       <a:off x="0" y="0"/>
-                      <a:ext cx="5400000" cy="4533333"/>
+                      <a:ext cx="5400000" cy="4680000"/>
                     </a:xfrm>
                     <a:prstGeom prst="rect"/>
                   </pic:spPr>

</xml_diff>

<commit_message>
Use Pico CSS for frontend styling
</commit_message>
<xml_diff>
--- a/Отчет_по_лабораторной_работе_Docker_Compose.docx
+++ b/Отчет_по_лабораторной_работе_Docker_Compose.docx
@@ -121,7 +121,7 @@
           </w:tcPr>
           <w:p>
             <w:r>
-              <w:t>Nginx</w:t>
+              <w:t>Nginx, Pico CSS</w:t>
             </w:r>
           </w:p>
         </w:tc>
@@ -294,7 +294,7 @@
       <w:r>
         <w:drawing>
           <wp:inline xmlns:a="http://schemas.openxmlformats.org/drawingml/2006/main" xmlns:pic="http://schemas.openxmlformats.org/drawingml/2006/picture">
-            <wp:extent cx="5400000" cy="4920000"/>
+            <wp:extent cx="5400000" cy="6570000"/>
             <wp:docPr id="1" name="Picture 1"/>
             <wp:cNvGraphicFramePr>
               <a:graphicFrameLocks noChangeAspect="1"/>
@@ -315,7 +315,7 @@
                   <pic:spPr>
                     <a:xfrm>
                       <a:off x="0" y="0"/>
-                      <a:ext cx="5400000" cy="4920000"/>
+                      <a:ext cx="5400000" cy="6570000"/>
                     </a:xfrm>
                     <a:prstGeom prst="rect"/>
                   </pic:spPr>
@@ -351,7 +351,7 @@
       <w:r>
         <w:drawing>
           <wp:inline xmlns:a="http://schemas.openxmlformats.org/drawingml/2006/main" xmlns:pic="http://schemas.openxmlformats.org/drawingml/2006/picture">
-            <wp:extent cx="5400000" cy="4680000"/>
+            <wp:extent cx="5400000" cy="6408000"/>
             <wp:docPr id="2" name="Picture 2"/>
             <wp:cNvGraphicFramePr>
               <a:graphicFrameLocks noChangeAspect="1"/>
@@ -372,7 +372,7 @@
                   <pic:spPr>
                     <a:xfrm>
                       <a:off x="0" y="0"/>
-                      <a:ext cx="5400000" cy="4680000"/>
+                      <a:ext cx="5400000" cy="6408000"/>
                     </a:xfrm>
                     <a:prstGeom prst="rect"/>
                   </pic:spPr>

</xml_diff>